<commit_message>
KUT pack: fix stale container examples, and the gate check that had gone vacuous
The issued playbook printed the originator PLN and a GA sheet typed SH (a
schedule); the BEP allocated the MIDP a withdrawn SC reference that the MIDP
itself contradicts. check_references matched only KUT-PLN-, so after the
PLN->SMB rename it examined nothing. Adds check_container_examples, proved
red against the previous documents before regenerating.

Co-Authored-By: Claude Opus 5.5 <noreply@anthropic.com>
</commit_message>
<xml_diff>
--- a/KUT_DOCS_WORKING/issued/KUT_BIM_Execution_Plan.docx
+++ b/KUT_DOCS_WORKING/issued/KUT_BIM_Execution_Plan.docx
@@ -15067,7 +15067,7 @@
                 <w:b w:val="0"/>
                 <w:sz w:val="16"/>
               </w:rPr>
-              <w:t>KUT-…-SH-A-0100</w:t>
+              <w:t>KUT-…-DR-A-0100</w:t>
             </w:r>
           </w:p>
         </w:tc>
@@ -41233,7 +41233,7 @@
                 <w:b w:val="0"/>
                 <w:sz w:val="17"/>
               </w:rPr>
-              <w:t>KUT-SMB-ZZ-ZZ-SC-Z-0001</w:t>
+              <w:t>KUT-SMB-ZZ-ZZ-SH-Z-0001</w:t>
             </w:r>
           </w:p>
         </w:tc>
@@ -41301,7 +41301,7 @@
                 <w:b w:val="0"/>
                 <w:sz w:val="17"/>
               </w:rPr>
-              <w:t>KUT-SMB-ZZ-ZZ-SC-Z-0002</w:t>
+              <w:t>KUT-SMB-ZZ-ZZ-SH-Z-0002</w:t>
             </w:r>
           </w:p>
         </w:tc>
@@ -41369,7 +41369,7 @@
                 <w:b w:val="0"/>
                 <w:sz w:val="17"/>
               </w:rPr>
-              <w:t>KUT-SMB-ZZ-ZZ-SC-Z-0003</w:t>
+              <w:t>KUT-SMB-ZZ-ZZ-SH-Z-0003</w:t>
             </w:r>
           </w:p>
         </w:tc>

</xml_diff>

<commit_message>
KUT: element discipline codes are their own list, not the container roles
The KUT discipline rule validated the element tag's discipline against the
ISO 19650 container role codes, so it rejected FP, LV and G - the codes the
tagger writes on sprinklers, fire alarm, comms and specialty equipment.
ISO 19650 defines the role of a file, not an element code. Adds
ASSET_DISCIPLINES to kut_naming.py, derives the rule from it, states the
split in the BEP, playbook and Document Control Standard, and tests the rule
against what the tagger can actually write (red on the old overlay).

Co-Authored-By: Claude Opus 5.5 <noreply@anthropic.com>
</commit_message>
<xml_diff>
--- a/KUT_DOCS_WORKING/issued/KUT_BIM_Execution_Plan.docx
+++ b/KUT_DOCS_WORKING/issued/KUT_BIM_Execution_Plan.docx
@@ -13636,7 +13636,625 @@
                 <w:b w:val="0"/>
                 <w:sz w:val="19"/>
               </w:rPr>
-              <w:t xml:space="preserve"> A container name carries the numbering value (01); an element tag carries the location code (BLD1). Section 1.3 relates them. Likewise the container ROLE field may be Z for a federated or multi-discipline container, while an element DISCIPLINE code is always one of the eight and is validated on every element — there is no such thing as a Z element.</w:t>
+              <w:t xml:space="preserve"> A container name carries the numbering value (01); an element tag carries the location code (BLD1). Section 1.3 relates them. Likewise the container ROLE and the element DISCIPLINE are different fields with different code lists. The role is the discipline of the organisation that produced the file (Section 4.2.1); the element discipline says what the element is, from the list below, and is validated on every element. ISO 19650 defines the first and not the second. A role is never derived from the elements in a container, and there is no such thing as a Z element.</w:t>
+            </w:r>
+          </w:p>
+        </w:tc>
+      </w:tr>
+    </w:tbl>
+    <w:p>
+      <w:pPr>
+        <w:spacing w:after="40"/>
+      </w:pPr>
+    </w:p>
+    <w:tbl>
+      <w:tblPr>
+        <w:tblStyle w:val="TableGrid"/>
+        <w:tblW w:type="auto" w:w="0"/>
+        <w:jc w:val="left"/>
+        <w:tblLook w:firstColumn="1" w:firstRow="1" w:lastColumn="0" w:lastRow="0" w:noHBand="0" w:noVBand="1" w:val="04A0"/>
+      </w:tblPr>
+      <w:tblGrid>
+        <w:gridCol w:w="3137"/>
+        <w:gridCol w:w="3137"/>
+        <w:gridCol w:w="3137"/>
+      </w:tblGrid>
+      <w:tr>
+        <w:trPr>
+          <w:tblHeader/>
+        </w:trPr>
+        <w:tc>
+          <w:tcPr>
+            <w:tcW w:type="dxa" w:w="1814"/>
+            <w:shd w:val="clear" w:fill="E8EDF3"/>
+          </w:tcPr>
+          <w:p>
+            <w:r/>
+            <w:r>
+              <w:rPr>
+                <w:b/>
+                <w:color w:val="1F3654"/>
+                <w:sz w:val="16"/>
+              </w:rPr>
+              <w:t>Element discipline</w:t>
+            </w:r>
+          </w:p>
+        </w:tc>
+        <w:tc>
+          <w:tcPr>
+            <w:tcW w:type="dxa" w:w="5102"/>
+            <w:shd w:val="clear" w:fill="E8EDF3"/>
+          </w:tcPr>
+          <w:p>
+            <w:r/>
+            <w:r>
+              <w:rPr>
+                <w:b/>
+                <w:color w:val="1F3654"/>
+                <w:sz w:val="16"/>
+              </w:rPr>
+              <w:t>Meaning</w:t>
+            </w:r>
+          </w:p>
+        </w:tc>
+        <w:tc>
+          <w:tcPr>
+            <w:tcW w:type="dxa" w:w="2494"/>
+            <w:shd w:val="clear" w:fill="E8EDF3"/>
+          </w:tcPr>
+          <w:p>
+            <w:r/>
+            <w:r>
+              <w:rPr>
+                <w:b/>
+                <w:color w:val="1F3654"/>
+                <w:sz w:val="16"/>
+              </w:rPr>
+              <w:t>Normally issued under role</w:t>
+            </w:r>
+          </w:p>
+        </w:tc>
+      </w:tr>
+      <w:tr>
+        <w:tc>
+          <w:tcPr>
+            <w:tcW w:type="dxa" w:w="1814"/>
+          </w:tcPr>
+          <w:p>
+            <w:pPr>
+              <w:spacing w:after="40"/>
+            </w:pPr>
+            <w:r>
+              <w:rPr>
+                <w:sz w:val="16"/>
+              </w:rPr>
+            </w:r>
+            <w:r>
+              <w:rPr>
+                <w:b w:val="0"/>
+                <w:sz w:val="16"/>
+              </w:rPr>
+              <w:t>A</w:t>
+            </w:r>
+          </w:p>
+        </w:tc>
+        <w:tc>
+          <w:tcPr>
+            <w:tcW w:type="dxa" w:w="5102"/>
+          </w:tcPr>
+          <w:p>
+            <w:pPr>
+              <w:spacing w:after="40"/>
+            </w:pPr>
+            <w:r>
+              <w:rPr>
+                <w:sz w:val="16"/>
+              </w:rPr>
+            </w:r>
+            <w:r>
+              <w:rPr>
+                <w:b w:val="0"/>
+                <w:sz w:val="16"/>
+              </w:rPr>
+              <w:t>Architecture -- including interiors, FF&amp;E and finishes</w:t>
+            </w:r>
+          </w:p>
+        </w:tc>
+        <w:tc>
+          <w:tcPr>
+            <w:tcW w:type="dxa" w:w="2494"/>
+          </w:tcPr>
+          <w:p>
+            <w:pPr>
+              <w:spacing w:after="40"/>
+            </w:pPr>
+            <w:r>
+              <w:rPr>
+                <w:sz w:val="16"/>
+              </w:rPr>
+            </w:r>
+            <w:r>
+              <w:rPr>
+                <w:b w:val="0"/>
+                <w:sz w:val="16"/>
+              </w:rPr>
+              <w:t>A</w:t>
+            </w:r>
+          </w:p>
+        </w:tc>
+      </w:tr>
+      <w:tr>
+        <w:tc>
+          <w:tcPr>
+            <w:tcW w:type="dxa" w:w="1814"/>
+          </w:tcPr>
+          <w:p>
+            <w:pPr>
+              <w:spacing w:after="40"/>
+            </w:pPr>
+            <w:r>
+              <w:rPr>
+                <w:sz w:val="16"/>
+              </w:rPr>
+            </w:r>
+            <w:r>
+              <w:rPr>
+                <w:b w:val="0"/>
+                <w:sz w:val="16"/>
+              </w:rPr>
+              <w:t>S</w:t>
+            </w:r>
+          </w:p>
+        </w:tc>
+        <w:tc>
+          <w:tcPr>
+            <w:tcW w:type="dxa" w:w="5102"/>
+          </w:tcPr>
+          <w:p>
+            <w:pPr>
+              <w:spacing w:after="40"/>
+            </w:pPr>
+            <w:r>
+              <w:rPr>
+                <w:sz w:val="16"/>
+              </w:rPr>
+            </w:r>
+            <w:r>
+              <w:rPr>
+                <w:b w:val="0"/>
+                <w:sz w:val="16"/>
+              </w:rPr>
+              <w:t>Structure</w:t>
+            </w:r>
+          </w:p>
+        </w:tc>
+        <w:tc>
+          <w:tcPr>
+            <w:tcW w:type="dxa" w:w="2494"/>
+          </w:tcPr>
+          <w:p>
+            <w:pPr>
+              <w:spacing w:after="40"/>
+            </w:pPr>
+            <w:r>
+              <w:rPr>
+                <w:sz w:val="16"/>
+              </w:rPr>
+            </w:r>
+            <w:r>
+              <w:rPr>
+                <w:b w:val="0"/>
+                <w:sz w:val="16"/>
+              </w:rPr>
+              <w:t>S</w:t>
+            </w:r>
+          </w:p>
+        </w:tc>
+      </w:tr>
+      <w:tr>
+        <w:tc>
+          <w:tcPr>
+            <w:tcW w:type="dxa" w:w="1814"/>
+          </w:tcPr>
+          <w:p>
+            <w:pPr>
+              <w:spacing w:after="40"/>
+            </w:pPr>
+            <w:r>
+              <w:rPr>
+                <w:sz w:val="16"/>
+              </w:rPr>
+            </w:r>
+            <w:r>
+              <w:rPr>
+                <w:b w:val="0"/>
+                <w:sz w:val="16"/>
+              </w:rPr>
+              <w:t>M</w:t>
+            </w:r>
+          </w:p>
+        </w:tc>
+        <w:tc>
+          <w:tcPr>
+            <w:tcW w:type="dxa" w:w="5102"/>
+          </w:tcPr>
+          <w:p>
+            <w:pPr>
+              <w:spacing w:after="40"/>
+            </w:pPr>
+            <w:r>
+              <w:rPr>
+                <w:sz w:val="16"/>
+              </w:rPr>
+            </w:r>
+            <w:r>
+              <w:rPr>
+                <w:b w:val="0"/>
+                <w:sz w:val="16"/>
+              </w:rPr>
+              <w:t>Mechanical -- including heating, cooling and ventilation pipework</w:t>
+            </w:r>
+          </w:p>
+        </w:tc>
+        <w:tc>
+          <w:tcPr>
+            <w:tcW w:type="dxa" w:w="2494"/>
+          </w:tcPr>
+          <w:p>
+            <w:pPr>
+              <w:spacing w:after="40"/>
+            </w:pPr>
+            <w:r>
+              <w:rPr>
+                <w:sz w:val="16"/>
+              </w:rPr>
+            </w:r>
+            <w:r>
+              <w:rPr>
+                <w:b w:val="0"/>
+                <w:sz w:val="16"/>
+              </w:rPr>
+              <w:t>M</w:t>
+            </w:r>
+          </w:p>
+        </w:tc>
+      </w:tr>
+      <w:tr>
+        <w:tc>
+          <w:tcPr>
+            <w:tcW w:type="dxa" w:w="1814"/>
+          </w:tcPr>
+          <w:p>
+            <w:pPr>
+              <w:spacing w:after="40"/>
+            </w:pPr>
+            <w:r>
+              <w:rPr>
+                <w:sz w:val="16"/>
+              </w:rPr>
+            </w:r>
+            <w:r>
+              <w:rPr>
+                <w:b w:val="0"/>
+                <w:sz w:val="16"/>
+              </w:rPr>
+              <w:t>E</w:t>
+            </w:r>
+          </w:p>
+        </w:tc>
+        <w:tc>
+          <w:tcPr>
+            <w:tcW w:type="dxa" w:w="5102"/>
+          </w:tcPr>
+          <w:p>
+            <w:pPr>
+              <w:spacing w:after="40"/>
+            </w:pPr>
+            <w:r>
+              <w:rPr>
+                <w:sz w:val="16"/>
+              </w:rPr>
+            </w:r>
+            <w:r>
+              <w:rPr>
+                <w:b w:val="0"/>
+                <w:sz w:val="16"/>
+              </w:rPr>
+              <w:t>Electrical -- power and lighting</w:t>
+            </w:r>
+          </w:p>
+        </w:tc>
+        <w:tc>
+          <w:tcPr>
+            <w:tcW w:type="dxa" w:w="2494"/>
+          </w:tcPr>
+          <w:p>
+            <w:pPr>
+              <w:spacing w:after="40"/>
+            </w:pPr>
+            <w:r>
+              <w:rPr>
+                <w:sz w:val="16"/>
+              </w:rPr>
+            </w:r>
+            <w:r>
+              <w:rPr>
+                <w:b w:val="0"/>
+                <w:sz w:val="16"/>
+              </w:rPr>
+              <w:t>E</w:t>
+            </w:r>
+          </w:p>
+        </w:tc>
+      </w:tr>
+      <w:tr>
+        <w:tc>
+          <w:tcPr>
+            <w:tcW w:type="dxa" w:w="1814"/>
+          </w:tcPr>
+          <w:p>
+            <w:pPr>
+              <w:spacing w:after="40"/>
+            </w:pPr>
+            <w:r>
+              <w:rPr>
+                <w:sz w:val="16"/>
+              </w:rPr>
+            </w:r>
+            <w:r>
+              <w:rPr>
+                <w:b w:val="0"/>
+                <w:sz w:val="16"/>
+              </w:rPr>
+              <w:t>P</w:t>
+            </w:r>
+          </w:p>
+        </w:tc>
+        <w:tc>
+          <w:tcPr>
+            <w:tcW w:type="dxa" w:w="5102"/>
+          </w:tcPr>
+          <w:p>
+            <w:pPr>
+              <w:spacing w:after="40"/>
+            </w:pPr>
+            <w:r>
+              <w:rPr>
+                <w:sz w:val="16"/>
+              </w:rPr>
+            </w:r>
+            <w:r>
+              <w:rPr>
+                <w:b w:val="0"/>
+                <w:sz w:val="16"/>
+              </w:rPr>
+              <w:t>Public health -- plumbing, drainage and gas</w:t>
+            </w:r>
+          </w:p>
+        </w:tc>
+        <w:tc>
+          <w:tcPr>
+            <w:tcW w:type="dxa" w:w="2494"/>
+          </w:tcPr>
+          <w:p>
+            <w:pPr>
+              <w:spacing w:after="40"/>
+            </w:pPr>
+            <w:r>
+              <w:rPr>
+                <w:sz w:val="16"/>
+              </w:rPr>
+            </w:r>
+            <w:r>
+              <w:rPr>
+                <w:b w:val="0"/>
+                <w:sz w:val="16"/>
+              </w:rPr>
+              <w:t>P</w:t>
+            </w:r>
+          </w:p>
+        </w:tc>
+      </w:tr>
+      <w:tr>
+        <w:tc>
+          <w:tcPr>
+            <w:tcW w:type="dxa" w:w="1814"/>
+          </w:tcPr>
+          <w:p>
+            <w:pPr>
+              <w:spacing w:after="40"/>
+            </w:pPr>
+            <w:r>
+              <w:rPr>
+                <w:sz w:val="16"/>
+              </w:rPr>
+            </w:r>
+            <w:r>
+              <w:rPr>
+                <w:b w:val="0"/>
+                <w:sz w:val="16"/>
+              </w:rPr>
+              <w:t>FP</w:t>
+            </w:r>
+          </w:p>
+        </w:tc>
+        <w:tc>
+          <w:tcPr>
+            <w:tcW w:type="dxa" w:w="5102"/>
+          </w:tcPr>
+          <w:p>
+            <w:pPr>
+              <w:spacing w:after="40"/>
+            </w:pPr>
+            <w:r>
+              <w:rPr>
+                <w:sz w:val="16"/>
+              </w:rPr>
+            </w:r>
+            <w:r>
+              <w:rPr>
+                <w:b w:val="0"/>
+                <w:sz w:val="16"/>
+              </w:rPr>
+              <w:t>Fire protection -- sprinklers, suppression and fire alarm devices</w:t>
+            </w:r>
+          </w:p>
+        </w:tc>
+        <w:tc>
+          <w:tcPr>
+            <w:tcW w:type="dxa" w:w="2494"/>
+          </w:tcPr>
+          <w:p>
+            <w:pPr>
+              <w:spacing w:after="40"/>
+            </w:pPr>
+            <w:r>
+              <w:rPr>
+                <w:sz w:val="16"/>
+              </w:rPr>
+            </w:r>
+            <w:r>
+              <w:rPr>
+                <w:b w:val="0"/>
+                <w:sz w:val="16"/>
+              </w:rPr>
+              <w:t>Y</w:t>
+            </w:r>
+          </w:p>
+        </w:tc>
+      </w:tr>
+      <w:tr>
+        <w:tc>
+          <w:tcPr>
+            <w:tcW w:type="dxa" w:w="1814"/>
+          </w:tcPr>
+          <w:p>
+            <w:pPr>
+              <w:spacing w:after="40"/>
+            </w:pPr>
+            <w:r>
+              <w:rPr>
+                <w:sz w:val="16"/>
+              </w:rPr>
+            </w:r>
+            <w:r>
+              <w:rPr>
+                <w:b w:val="0"/>
+                <w:sz w:val="16"/>
+              </w:rPr>
+              <w:t>LV</w:t>
+            </w:r>
+          </w:p>
+        </w:tc>
+        <w:tc>
+          <w:tcPr>
+            <w:tcW w:type="dxa" w:w="5102"/>
+          </w:tcPr>
+          <w:p>
+            <w:pPr>
+              <w:spacing w:after="40"/>
+            </w:pPr>
+            <w:r>
+              <w:rPr>
+                <w:sz w:val="16"/>
+              </w:rPr>
+            </w:r>
+            <w:r>
+              <w:rPr>
+                <w:b w:val="0"/>
+                <w:sz w:val="16"/>
+              </w:rPr>
+              <w:t>Low voltage -- data, communications, security and audio-visual</w:t>
+            </w:r>
+          </w:p>
+        </w:tc>
+        <w:tc>
+          <w:tcPr>
+            <w:tcW w:type="dxa" w:w="2494"/>
+          </w:tcPr>
+          <w:p>
+            <w:pPr>
+              <w:spacing w:after="40"/>
+            </w:pPr>
+            <w:r>
+              <w:rPr>
+                <w:sz w:val="16"/>
+              </w:rPr>
+            </w:r>
+            <w:r>
+              <w:rPr>
+                <w:b w:val="0"/>
+                <w:sz w:val="16"/>
+              </w:rPr>
+              <w:t>Y</w:t>
+            </w:r>
+          </w:p>
+        </w:tc>
+      </w:tr>
+      <w:tr>
+        <w:tc>
+          <w:tcPr>
+            <w:tcW w:type="dxa" w:w="1814"/>
+          </w:tcPr>
+          <w:p>
+            <w:pPr>
+              <w:spacing w:after="40"/>
+            </w:pPr>
+            <w:r>
+              <w:rPr>
+                <w:sz w:val="16"/>
+              </w:rPr>
+            </w:r>
+            <w:r>
+              <w:rPr>
+                <w:b w:val="0"/>
+                <w:sz w:val="16"/>
+              </w:rPr>
+              <w:t>G</w:t>
+            </w:r>
+          </w:p>
+        </w:tc>
+        <w:tc>
+          <w:tcPr>
+            <w:tcW w:type="dxa" w:w="5102"/>
+          </w:tcPr>
+          <w:p>
+            <w:pPr>
+              <w:spacing w:after="40"/>
+            </w:pPr>
+            <w:r>
+              <w:rPr>
+                <w:sz w:val="16"/>
+              </w:rPr>
+            </w:r>
+            <w:r>
+              <w:rPr>
+                <w:b w:val="0"/>
+                <w:sz w:val="16"/>
+              </w:rPr>
+              <w:t>General -- generic models, specialty equipment and model groups</w:t>
+            </w:r>
+          </w:p>
+        </w:tc>
+        <w:tc>
+          <w:tcPr>
+            <w:tcW w:type="dxa" w:w="2494"/>
+          </w:tcPr>
+          <w:p>
+            <w:pPr>
+              <w:spacing w:after="40"/>
+            </w:pPr>
+            <w:r>
+              <w:rPr>
+                <w:sz w:val="16"/>
+              </w:rPr>
+            </w:r>
+            <w:r>
+              <w:rPr>
+                <w:b w:val="0"/>
+                <w:sz w:val="16"/>
+              </w:rPr>
+              <w:t>The role of whichever model it is in</w:t>
             </w:r>
           </w:p>
         </w:tc>

</xml_diff>